<commit_message>
Re-render enterprise samples with flowchart routing.
Present layout-reversed serving, realization and assignment to the flowchart router in the downward layout direction so they stay on the spine instead of retry-loop corridors. Refresh 00-12 SVG/PNG and the sample DOCX.

Co-authored-by: Dave Robinson <windows_mcp@hotmail.com>
</commit_message>
<xml_diff>
--- a/docs/enterprise/rendered/enterprise-samples.docx
+++ b/docs/enterprise/rendered/enterprise-samples.docx
@@ -6,7 +6,7 @@
       <w:pPr>
         <w:pStyle w:val="Heading1"/>
       </w:pPr>
-      <w:bookmarkStart w:name="Md_de2eed77133f41758e3122afbb2c045b" w:id="0"/>
+      <w:bookmarkStart w:name="Md_2c93f20dfd584276b42f1c2dff4f3651" w:id="0"/>
       <w:r>
         <w:rPr/>
         <w:t xml:space="preserve">Enterprise diagram samples</w:t>
@@ -26,7 +26,7 @@
       <w:pPr>
         <w:pStyle w:val="Heading2"/>
       </w:pPr>
-      <w:bookmarkStart w:name="Md_76ee7c7ca94944c99edd95627bb80a09" w:id="1"/>
+      <w:bookmarkStart w:name="Md_9aa9a80f2f3e416ab2ba1f146854434e" w:id="1"/>
       <w:r>
         <w:rPr/>
         <w:t xml:space="preserve">Cross-layer web shop</w:t>
@@ -41,7 +41,7 @@
       <w:r>
         <w:drawing>
           <wp:inline xmlns:wp="http://schemas.openxmlformats.org/drawingml/2006/wordprocessingDrawing" distT="0" distB="0" distL="0" distR="0">
-            <wp:extent cx="4958905" cy="6480000"/>
+            <wp:extent cx="4974750" cy="6480000"/>
             <wp:effectExtent l="0" t="0" r="0" b="0"/>
             <wp:docPr id="1" name="Mermaid diagram 1" descr="Mermaid diagram"/>
             <wp:cNvGraphicFramePr>
@@ -55,7 +55,7 @@
                     <pic:cNvPicPr/>
                   </pic:nvPicPr>
                   <pic:blipFill>
-                    <a:blip xmlns:r="http://schemas.openxmlformats.org/officeDocument/2006/relationships" r:embed="Rb4b14b0182884b43"/>
+                    <a:blip xmlns:r="http://schemas.openxmlformats.org/officeDocument/2006/relationships" r:embed="R5cf33d6f4b9a43a1"/>
                     <a:stretch>
                       <a:fillRect/>
                     </a:stretch>
@@ -63,7 +63,7 @@
                   <pic:spPr>
                     <a:xfrm>
                       <a:off x="0" y="0"/>
-                      <a:ext cx="4958905" cy="6480000"/>
+                      <a:ext cx="4974750" cy="6480000"/>
                     </a:xfrm>
                     <a:prstGeom prst="rect">
                       <a:avLst/>
@@ -80,7 +80,7 @@
       <w:pPr>
         <w:pStyle w:val="Heading2"/>
       </w:pPr>
-      <w:bookmarkStart w:name="Md_d92576bfb0e94078b7092dfa4f3222b9" w:id="2"/>
+      <w:bookmarkStart w:name="Md_fc946d8a9e9f4164b6ec42029e0ff1c5" w:id="2"/>
       <w:r>
         <w:rPr/>
         <w:t xml:space="preserve">Business layer</w:t>
@@ -95,7 +95,7 @@
       <w:r>
         <w:drawing>
           <wp:inline xmlns:wp="http://schemas.openxmlformats.org/drawingml/2006/wordprocessingDrawing" distT="0" distB="0" distL="0" distR="0">
-            <wp:extent cx="5220000" cy="5385090"/>
+            <wp:extent cx="5220000" cy="5382641"/>
             <wp:effectExtent l="0" t="0" r="0" b="0"/>
             <wp:docPr id="2" name="Mermaid diagram 2" descr="Mermaid diagram"/>
             <wp:cNvGraphicFramePr>
@@ -109,7 +109,7 @@
                     <pic:cNvPicPr/>
                   </pic:nvPicPr>
                   <pic:blipFill>
-                    <a:blip xmlns:r="http://schemas.openxmlformats.org/officeDocument/2006/relationships" r:embed="R736d9d5955f04456"/>
+                    <a:blip xmlns:r="http://schemas.openxmlformats.org/officeDocument/2006/relationships" r:embed="Rfa58feb89abc4179"/>
                     <a:stretch>
                       <a:fillRect/>
                     </a:stretch>
@@ -117,7 +117,7 @@
                   <pic:spPr>
                     <a:xfrm>
                       <a:off x="0" y="0"/>
-                      <a:ext cx="5220000" cy="5385090"/>
+                      <a:ext cx="5220000" cy="5382641"/>
                     </a:xfrm>
                     <a:prstGeom prst="rect">
                       <a:avLst/>
@@ -134,7 +134,7 @@
       <w:pPr>
         <w:pStyle w:val="Heading2"/>
       </w:pPr>
-      <w:bookmarkStart w:name="Md_b6bd23ad20b549e6a0560db7cae6627e" w:id="3"/>
+      <w:bookmarkStart w:name="Md_5ededc9f2ea041ea9f10d199fbd13a31" w:id="3"/>
       <w:r>
         <w:rPr/>
         <w:t xml:space="preserve">Motivation</w:t>
@@ -149,7 +149,7 @@
       <w:r>
         <w:drawing>
           <wp:inline xmlns:wp="http://schemas.openxmlformats.org/drawingml/2006/wordprocessingDrawing" distT="0" distB="0" distL="0" distR="0">
-            <wp:extent cx="3790950" cy="5476875"/>
+            <wp:extent cx="3886200" cy="5572125"/>
             <wp:effectExtent l="0" t="0" r="0" b="0"/>
             <wp:docPr id="3" name="Mermaid diagram 3" descr="Mermaid diagram"/>
             <wp:cNvGraphicFramePr>
@@ -163,7 +163,7 @@
                     <pic:cNvPicPr/>
                   </pic:nvPicPr>
                   <pic:blipFill>
-                    <a:blip xmlns:r="http://schemas.openxmlformats.org/officeDocument/2006/relationships" r:embed="Rf67e74025c8d4e3a"/>
+                    <a:blip xmlns:r="http://schemas.openxmlformats.org/officeDocument/2006/relationships" r:embed="R72f15c5be25c4798"/>
                     <a:stretch>
                       <a:fillRect/>
                     </a:stretch>
@@ -171,7 +171,7 @@
                   <pic:spPr>
                     <a:xfrm>
                       <a:off x="0" y="0"/>
-                      <a:ext cx="3790950" cy="5476875"/>
+                      <a:ext cx="3886200" cy="5572125"/>
                     </a:xfrm>
                     <a:prstGeom prst="rect">
                       <a:avLst/>
@@ -188,7 +188,7 @@
       <w:pPr>
         <w:pStyle w:val="Heading2"/>
       </w:pPr>
-      <w:bookmarkStart w:name="Md_d571a9441f084d3384f592530d959a2a" w:id="4"/>
+      <w:bookmarkStart w:name="Md_6eb3331d3d4d4557ad670f2da9074f47" w:id="4"/>
       <w:r>
         <w:rPr/>
         <w:t xml:space="preserve">Motivation to Technology</w:t>
@@ -203,7 +203,7 @@
       <w:r>
         <w:drawing>
           <wp:inline xmlns:wp="http://schemas.openxmlformats.org/drawingml/2006/wordprocessingDrawing" distT="0" distB="0" distL="0" distR="0">
-            <wp:extent cx="4933950" cy="5476875"/>
+            <wp:extent cx="5220000" cy="5246907"/>
             <wp:effectExtent l="0" t="0" r="0" b="0"/>
             <wp:docPr id="4" name="Mermaid diagram 4" descr="Mermaid diagram"/>
             <wp:cNvGraphicFramePr>
@@ -217,7 +217,7 @@
                     <pic:cNvPicPr/>
                   </pic:nvPicPr>
                   <pic:blipFill>
-                    <a:blip xmlns:r="http://schemas.openxmlformats.org/officeDocument/2006/relationships" r:embed="R35867307764245a4"/>
+                    <a:blip xmlns:r="http://schemas.openxmlformats.org/officeDocument/2006/relationships" r:embed="R3969809787684321"/>
                     <a:stretch>
                       <a:fillRect/>
                     </a:stretch>
@@ -225,7 +225,7 @@
                   <pic:spPr>
                     <a:xfrm>
                       <a:off x="0" y="0"/>
-                      <a:ext cx="4933950" cy="5476875"/>
+                      <a:ext cx="5220000" cy="5246907"/>
                     </a:xfrm>
                     <a:prstGeom prst="rect">
                       <a:avLst/>

</xml_diff>

<commit_message>
Drop duplicated error banner on invalid enterprise sample renders.
Co-authored-by: Dave Robinson <windows_mcp@hotmail.com>
</commit_message>
<xml_diff>
--- a/docs/enterprise/rendered/enterprise-samples.docx
+++ b/docs/enterprise/rendered/enterprise-samples.docx
@@ -6,7 +6,7 @@
       <w:pPr>
         <w:pStyle w:val="Heading1"/>
       </w:pPr>
-      <w:bookmarkStart w:name="Md_2c93f20dfd584276b42f1c2dff4f3651" w:id="0"/>
+      <w:bookmarkStart w:name="Md_33a65833565b489fb5853090553c0cbd" w:id="0"/>
       <w:r>
         <w:rPr/>
         <w:t xml:space="preserve">Enterprise diagram samples</w:t>
@@ -26,7 +26,7 @@
       <w:pPr>
         <w:pStyle w:val="Heading2"/>
       </w:pPr>
-      <w:bookmarkStart w:name="Md_9aa9a80f2f3e416ab2ba1f146854434e" w:id="1"/>
+      <w:bookmarkStart w:name="Md_fc3482623731432c97cd0938b3a42348" w:id="1"/>
       <w:r>
         <w:rPr/>
         <w:t xml:space="preserve">Cross-layer web shop</w:t>
@@ -55,7 +55,7 @@
                     <pic:cNvPicPr/>
                   </pic:nvPicPr>
                   <pic:blipFill>
-                    <a:blip xmlns:r="http://schemas.openxmlformats.org/officeDocument/2006/relationships" r:embed="R5cf33d6f4b9a43a1"/>
+                    <a:blip xmlns:r="http://schemas.openxmlformats.org/officeDocument/2006/relationships" r:embed="R36361a5a69404cac"/>
                     <a:stretch>
                       <a:fillRect/>
                     </a:stretch>
@@ -80,7 +80,7 @@
       <w:pPr>
         <w:pStyle w:val="Heading2"/>
       </w:pPr>
-      <w:bookmarkStart w:name="Md_fc946d8a9e9f4164b6ec42029e0ff1c5" w:id="2"/>
+      <w:bookmarkStart w:name="Md_320ab929ce9a46079b168439996fb845" w:id="2"/>
       <w:r>
         <w:rPr/>
         <w:t xml:space="preserve">Business layer</w:t>
@@ -109,7 +109,7 @@
                     <pic:cNvPicPr/>
                   </pic:nvPicPr>
                   <pic:blipFill>
-                    <a:blip xmlns:r="http://schemas.openxmlformats.org/officeDocument/2006/relationships" r:embed="Rfa58feb89abc4179"/>
+                    <a:blip xmlns:r="http://schemas.openxmlformats.org/officeDocument/2006/relationships" r:embed="R153d679c9e8f4ffc"/>
                     <a:stretch>
                       <a:fillRect/>
                     </a:stretch>
@@ -134,7 +134,7 @@
       <w:pPr>
         <w:pStyle w:val="Heading2"/>
       </w:pPr>
-      <w:bookmarkStart w:name="Md_5ededc9f2ea041ea9f10d199fbd13a31" w:id="3"/>
+      <w:bookmarkStart w:name="Md_7c8098522f5042ba8acaa9d0f21d41e1" w:id="3"/>
       <w:r>
         <w:rPr/>
         <w:t xml:space="preserve">Motivation</w:t>
@@ -163,7 +163,7 @@
                     <pic:cNvPicPr/>
                   </pic:nvPicPr>
                   <pic:blipFill>
-                    <a:blip xmlns:r="http://schemas.openxmlformats.org/officeDocument/2006/relationships" r:embed="R72f15c5be25c4798"/>
+                    <a:blip xmlns:r="http://schemas.openxmlformats.org/officeDocument/2006/relationships" r:embed="R12a533338a20438c"/>
                     <a:stretch>
                       <a:fillRect/>
                     </a:stretch>
@@ -188,7 +188,7 @@
       <w:pPr>
         <w:pStyle w:val="Heading2"/>
       </w:pPr>
-      <w:bookmarkStart w:name="Md_6eb3331d3d4d4557ad670f2da9074f47" w:id="4"/>
+      <w:bookmarkStart w:name="Md_447377ec0ae948eb86704689827c0825" w:id="4"/>
       <w:r>
         <w:rPr/>
         <w:t xml:space="preserve">Motivation to Technology</w:t>
@@ -217,7 +217,7 @@
                     <pic:cNvPicPr/>
                   </pic:nvPicPr>
                   <pic:blipFill>
-                    <a:blip xmlns:r="http://schemas.openxmlformats.org/officeDocument/2006/relationships" r:embed="R3969809787684321"/>
+                    <a:blip xmlns:r="http://schemas.openxmlformats.org/officeDocument/2006/relationships" r:embed="Rc5cde144a9b946a2"/>
                     <a:stretch>
                       <a:fillRect/>
                     </a:stretch>

</xml_diff>

<commit_message>
Keep enterprise edges off nodes, titles and group tabs.
Route around non-endpoint boxes with an orthogonal obstacle map when the flowchart path would cut a node, title or group tab. Spread attachment points so markers do not stack, cross groups at a right angle away from the tab, and add a geometry test for samples 01-12.

Co-authored-by: Dave Robinson <windows_mcp@hotmail.com>
</commit_message>
<xml_diff>
--- a/docs/enterprise/rendered/enterprise-samples.docx
+++ b/docs/enterprise/rendered/enterprise-samples.docx
@@ -6,7 +6,7 @@
       <w:pPr>
         <w:pStyle w:val="Heading1"/>
       </w:pPr>
-      <w:bookmarkStart w:name="Md_33a65833565b489fb5853090553c0cbd" w:id="0"/>
+      <w:bookmarkStart w:name="Md_1ea8adf9c5f941a78fae26d8a0c11c1f" w:id="0"/>
       <w:r>
         <w:rPr/>
         <w:t xml:space="preserve">Enterprise diagram samples</w:t>
@@ -26,7 +26,7 @@
       <w:pPr>
         <w:pStyle w:val="Heading2"/>
       </w:pPr>
-      <w:bookmarkStart w:name="Md_fc3482623731432c97cd0938b3a42348" w:id="1"/>
+      <w:bookmarkStart w:name="Md_8642f0a53000421290788b0853e93a3c" w:id="1"/>
       <w:r>
         <w:rPr/>
         <w:t xml:space="preserve">Cross-layer web shop</w:t>
@@ -55,7 +55,7 @@
                     <pic:cNvPicPr/>
                   </pic:nvPicPr>
                   <pic:blipFill>
-                    <a:blip xmlns:r="http://schemas.openxmlformats.org/officeDocument/2006/relationships" r:embed="R36361a5a69404cac"/>
+                    <a:blip xmlns:r="http://schemas.openxmlformats.org/officeDocument/2006/relationships" r:embed="Rc1ab3145c94a4984"/>
                     <a:stretch>
                       <a:fillRect/>
                     </a:stretch>
@@ -80,7 +80,7 @@
       <w:pPr>
         <w:pStyle w:val="Heading2"/>
       </w:pPr>
-      <w:bookmarkStart w:name="Md_320ab929ce9a46079b168439996fb845" w:id="2"/>
+      <w:bookmarkStart w:name="Md_e6831e27e37342d2bfa73184eb501c9e" w:id="2"/>
       <w:r>
         <w:rPr/>
         <w:t xml:space="preserve">Business layer</w:t>
@@ -109,7 +109,7 @@
                     <pic:cNvPicPr/>
                   </pic:nvPicPr>
                   <pic:blipFill>
-                    <a:blip xmlns:r="http://schemas.openxmlformats.org/officeDocument/2006/relationships" r:embed="R153d679c9e8f4ffc"/>
+                    <a:blip xmlns:r="http://schemas.openxmlformats.org/officeDocument/2006/relationships" r:embed="Raf0269051f5d41aa"/>
                     <a:stretch>
                       <a:fillRect/>
                     </a:stretch>
@@ -134,7 +134,7 @@
       <w:pPr>
         <w:pStyle w:val="Heading2"/>
       </w:pPr>
-      <w:bookmarkStart w:name="Md_7c8098522f5042ba8acaa9d0f21d41e1" w:id="3"/>
+      <w:bookmarkStart w:name="Md_0dba2e1d3a62485c8aff423597b08c1b" w:id="3"/>
       <w:r>
         <w:rPr/>
         <w:t xml:space="preserve">Motivation</w:t>
@@ -163,7 +163,7 @@
                     <pic:cNvPicPr/>
                   </pic:nvPicPr>
                   <pic:blipFill>
-                    <a:blip xmlns:r="http://schemas.openxmlformats.org/officeDocument/2006/relationships" r:embed="R12a533338a20438c"/>
+                    <a:blip xmlns:r="http://schemas.openxmlformats.org/officeDocument/2006/relationships" r:embed="Rd469079bb3d14133"/>
                     <a:stretch>
                       <a:fillRect/>
                     </a:stretch>
@@ -188,7 +188,7 @@
       <w:pPr>
         <w:pStyle w:val="Heading2"/>
       </w:pPr>
-      <w:bookmarkStart w:name="Md_447377ec0ae948eb86704689827c0825" w:id="4"/>
+      <w:bookmarkStart w:name="Md_b6baff7b712b44639b6661d8706d5c7e" w:id="4"/>
       <w:r>
         <w:rPr/>
         <w:t xml:space="preserve">Motivation to Technology</w:t>
@@ -217,7 +217,7 @@
                     <pic:cNvPicPr/>
                   </pic:nvPicPr>
                   <pic:blipFill>
-                    <a:blip xmlns:r="http://schemas.openxmlformats.org/officeDocument/2006/relationships" r:embed="Rc5cde144a9b946a2"/>
+                    <a:blip xmlns:r="http://schemas.openxmlformats.org/officeDocument/2006/relationships" r:embed="R4631b44d3b9b4594"/>
                     <a:stretch>
                       <a:fillRect/>
                     </a:stretch>

</xml_diff>

<commit_message>
Keep nested exits off titles and re-render enterprise samples.
Nested children leave a compound on the outer side. Attach stubs stay
outward, exact-overlap channels are separated by 8 px, and samples 00-12
are re-rendered with the one-style orthogonal corridors.

Co-authored-by: Dave Robinson <windows_mcp@hotmail.com>
</commit_message>
<xml_diff>
--- a/docs/enterprise/rendered/enterprise-samples.docx
+++ b/docs/enterprise/rendered/enterprise-samples.docx
@@ -6,7 +6,7 @@
       <w:pPr>
         <w:pStyle w:val="Heading1"/>
       </w:pPr>
-      <w:bookmarkStart w:name="Md_1ea8adf9c5f941a78fae26d8a0c11c1f" w:id="0"/>
+      <w:bookmarkStart w:name="Md_877c9050990f4858b82fa6697fe0d9da" w:id="0"/>
       <w:r>
         <w:rPr/>
         <w:t xml:space="preserve">Enterprise diagram samples</w:t>
@@ -26,7 +26,7 @@
       <w:pPr>
         <w:pStyle w:val="Heading2"/>
       </w:pPr>
-      <w:bookmarkStart w:name="Md_8642f0a53000421290788b0853e93a3c" w:id="1"/>
+      <w:bookmarkStart w:name="Md_8705d50e7923406292af4236401b6a65" w:id="1"/>
       <w:r>
         <w:rPr/>
         <w:t xml:space="preserve">Cross-layer web shop</w:t>
@@ -41,7 +41,7 @@
       <w:r>
         <w:drawing>
           <wp:inline xmlns:wp="http://schemas.openxmlformats.org/drawingml/2006/wordprocessingDrawing" distT="0" distB="0" distL="0" distR="0">
-            <wp:extent cx="4974750" cy="6480000"/>
+            <wp:extent cx="4796584" cy="6480000"/>
             <wp:effectExtent l="0" t="0" r="0" b="0"/>
             <wp:docPr id="1" name="Mermaid diagram 1" descr="Mermaid diagram"/>
             <wp:cNvGraphicFramePr>
@@ -55,7 +55,7 @@
                     <pic:cNvPicPr/>
                   </pic:nvPicPr>
                   <pic:blipFill>
-                    <a:blip xmlns:r="http://schemas.openxmlformats.org/officeDocument/2006/relationships" r:embed="Rc1ab3145c94a4984"/>
+                    <a:blip xmlns:r="http://schemas.openxmlformats.org/officeDocument/2006/relationships" r:embed="R48ae4b9cba4f4382"/>
                     <a:stretch>
                       <a:fillRect/>
                     </a:stretch>
@@ -63,7 +63,7 @@
                   <pic:spPr>
                     <a:xfrm>
                       <a:off x="0" y="0"/>
-                      <a:ext cx="4974750" cy="6480000"/>
+                      <a:ext cx="4796584" cy="6480000"/>
                     </a:xfrm>
                     <a:prstGeom prst="rect">
                       <a:avLst/>
@@ -80,7 +80,7 @@
       <w:pPr>
         <w:pStyle w:val="Heading2"/>
       </w:pPr>
-      <w:bookmarkStart w:name="Md_e6831e27e37342d2bfa73184eb501c9e" w:id="2"/>
+      <w:bookmarkStart w:name="Md_d304c6c279cd4580883082c89bb2a726" w:id="2"/>
       <w:r>
         <w:rPr/>
         <w:t xml:space="preserve">Business layer</w:t>
@@ -95,7 +95,7 @@
       <w:r>
         <w:drawing>
           <wp:inline xmlns:wp="http://schemas.openxmlformats.org/drawingml/2006/wordprocessingDrawing" distT="0" distB="0" distL="0" distR="0">
-            <wp:extent cx="5220000" cy="5382641"/>
+            <wp:extent cx="5220000" cy="5592355"/>
             <wp:effectExtent l="0" t="0" r="0" b="0"/>
             <wp:docPr id="2" name="Mermaid diagram 2" descr="Mermaid diagram"/>
             <wp:cNvGraphicFramePr>
@@ -109,7 +109,7 @@
                     <pic:cNvPicPr/>
                   </pic:nvPicPr>
                   <pic:blipFill>
-                    <a:blip xmlns:r="http://schemas.openxmlformats.org/officeDocument/2006/relationships" r:embed="Raf0269051f5d41aa"/>
+                    <a:blip xmlns:r="http://schemas.openxmlformats.org/officeDocument/2006/relationships" r:embed="Rf138436b6838432a"/>
                     <a:stretch>
                       <a:fillRect/>
                     </a:stretch>
@@ -117,7 +117,7 @@
                   <pic:spPr>
                     <a:xfrm>
                       <a:off x="0" y="0"/>
-                      <a:ext cx="5220000" cy="5382641"/>
+                      <a:ext cx="5220000" cy="5592355"/>
                     </a:xfrm>
                     <a:prstGeom prst="rect">
                       <a:avLst/>
@@ -134,7 +134,7 @@
       <w:pPr>
         <w:pStyle w:val="Heading2"/>
       </w:pPr>
-      <w:bookmarkStart w:name="Md_0dba2e1d3a62485c8aff423597b08c1b" w:id="3"/>
+      <w:bookmarkStart w:name="Md_e667d34ba8ae4ae68ef89dc8e1d8e7ab" w:id="3"/>
       <w:r>
         <w:rPr/>
         <w:t xml:space="preserve">Motivation</w:t>
@@ -149,7 +149,7 @@
       <w:r>
         <w:drawing>
           <wp:inline xmlns:wp="http://schemas.openxmlformats.org/drawingml/2006/wordprocessingDrawing" distT="0" distB="0" distL="0" distR="0">
-            <wp:extent cx="3886200" cy="5572125"/>
+            <wp:extent cx="4257675" cy="6372225"/>
             <wp:effectExtent l="0" t="0" r="0" b="0"/>
             <wp:docPr id="3" name="Mermaid diagram 3" descr="Mermaid diagram"/>
             <wp:cNvGraphicFramePr>
@@ -163,7 +163,7 @@
                     <pic:cNvPicPr/>
                   </pic:nvPicPr>
                   <pic:blipFill>
-                    <a:blip xmlns:r="http://schemas.openxmlformats.org/officeDocument/2006/relationships" r:embed="Rd469079bb3d14133"/>
+                    <a:blip xmlns:r="http://schemas.openxmlformats.org/officeDocument/2006/relationships" r:embed="Rb8f1b276654c46ce"/>
                     <a:stretch>
                       <a:fillRect/>
                     </a:stretch>
@@ -171,7 +171,7 @@
                   <pic:spPr>
                     <a:xfrm>
                       <a:off x="0" y="0"/>
-                      <a:ext cx="3886200" cy="5572125"/>
+                      <a:ext cx="4257675" cy="6372225"/>
                     </a:xfrm>
                     <a:prstGeom prst="rect">
                       <a:avLst/>
@@ -188,7 +188,7 @@
       <w:pPr>
         <w:pStyle w:val="Heading2"/>
       </w:pPr>
-      <w:bookmarkStart w:name="Md_b6baff7b712b44639b6661d8706d5c7e" w:id="4"/>
+      <w:bookmarkStart w:name="Md_044d82fab0b749b196b0a7361961322e" w:id="4"/>
       <w:r>
         <w:rPr/>
         <w:t xml:space="preserve">Motivation to Technology</w:t>
@@ -203,7 +203,7 @@
       <w:r>
         <w:drawing>
           <wp:inline xmlns:wp="http://schemas.openxmlformats.org/drawingml/2006/wordprocessingDrawing" distT="0" distB="0" distL="0" distR="0">
-            <wp:extent cx="5220000" cy="5246907"/>
+            <wp:extent cx="5220000" cy="5490849"/>
             <wp:effectExtent l="0" t="0" r="0" b="0"/>
             <wp:docPr id="4" name="Mermaid diagram 4" descr="Mermaid diagram"/>
             <wp:cNvGraphicFramePr>
@@ -217,7 +217,7 @@
                     <pic:cNvPicPr/>
                   </pic:nvPicPr>
                   <pic:blipFill>
-                    <a:blip xmlns:r="http://schemas.openxmlformats.org/officeDocument/2006/relationships" r:embed="R4631b44d3b9b4594"/>
+                    <a:blip xmlns:r="http://schemas.openxmlformats.org/officeDocument/2006/relationships" r:embed="Rf87379f73a1b400f"/>
                     <a:stretch>
                       <a:fillRect/>
                     </a:stretch>
@@ -225,7 +225,7 @@
                   <pic:spPr>
                     <a:xfrm>
                       <a:off x="0" y="0"/>
-                      <a:ext cx="5220000" cy="5246907"/>
+                      <a:ext cx="5220000" cy="5490849"/>
                     </a:xfrm>
                     <a:prstGeom prst="rect">
                       <a:avLst/>

</xml_diff>

<commit_message>
Re-render enterprise samples 00-12 on the flowchart routing path.
Refresh SVG, Svg.Skia PNGs, and the sample DOCX so review matches the
shared markdown2docx layout and connector path.

Co-authored-by: Dave Robinson <windows_mcp@hotmail.com>
</commit_message>
<xml_diff>
--- a/docs/enterprise/rendered/enterprise-samples.docx
+++ b/docs/enterprise/rendered/enterprise-samples.docx
@@ -6,7 +6,7 @@
       <w:pPr>
         <w:pStyle w:val="Heading1"/>
       </w:pPr>
-      <w:bookmarkStart w:name="Md_1ea8adf9c5f941a78fae26d8a0c11c1f" w:id="0"/>
+      <w:bookmarkStart w:name="Md_a1376cc78d9741dc883bdf890312ae36" w:id="0"/>
       <w:r>
         <w:rPr/>
         <w:t xml:space="preserve">Enterprise diagram samples</w:t>
@@ -26,7 +26,7 @@
       <w:pPr>
         <w:pStyle w:val="Heading2"/>
       </w:pPr>
-      <w:bookmarkStart w:name="Md_8642f0a53000421290788b0853e93a3c" w:id="1"/>
+      <w:bookmarkStart w:name="Md_6e6e6eef570f40fa9fd14f70d9127855" w:id="1"/>
       <w:r>
         <w:rPr/>
         <w:t xml:space="preserve">Cross-layer web shop</w:t>
@@ -41,7 +41,7 @@
       <w:r>
         <w:drawing>
           <wp:inline xmlns:wp="http://schemas.openxmlformats.org/drawingml/2006/wordprocessingDrawing" distT="0" distB="0" distL="0" distR="0">
-            <wp:extent cx="4974750" cy="6480000"/>
+            <wp:extent cx="5220000" cy="3238489"/>
             <wp:effectExtent l="0" t="0" r="0" b="0"/>
             <wp:docPr id="1" name="Mermaid diagram 1" descr="Mermaid diagram"/>
             <wp:cNvGraphicFramePr>
@@ -55,7 +55,7 @@
                     <pic:cNvPicPr/>
                   </pic:nvPicPr>
                   <pic:blipFill>
-                    <a:blip xmlns:r="http://schemas.openxmlformats.org/officeDocument/2006/relationships" r:embed="Rc1ab3145c94a4984"/>
+                    <a:blip xmlns:r="http://schemas.openxmlformats.org/officeDocument/2006/relationships" r:embed="R6505b8c3d7d4436f"/>
                     <a:stretch>
                       <a:fillRect/>
                     </a:stretch>
@@ -63,7 +63,7 @@
                   <pic:spPr>
                     <a:xfrm>
                       <a:off x="0" y="0"/>
-                      <a:ext cx="4974750" cy="6480000"/>
+                      <a:ext cx="5220000" cy="3238489"/>
                     </a:xfrm>
                     <a:prstGeom prst="rect">
                       <a:avLst/>
@@ -80,7 +80,7 @@
       <w:pPr>
         <w:pStyle w:val="Heading2"/>
       </w:pPr>
-      <w:bookmarkStart w:name="Md_e6831e27e37342d2bfa73184eb501c9e" w:id="2"/>
+      <w:bookmarkStart w:name="Md_3dc9f84c1a424d01ad034ecfb5b3f2c0" w:id="2"/>
       <w:r>
         <w:rPr/>
         <w:t xml:space="preserve">Business layer</w:t>
@@ -95,7 +95,7 @@
       <w:r>
         <w:drawing>
           <wp:inline xmlns:wp="http://schemas.openxmlformats.org/drawingml/2006/wordprocessingDrawing" distT="0" distB="0" distL="0" distR="0">
-            <wp:extent cx="5220000" cy="5382641"/>
+            <wp:extent cx="5220000" cy="1603402"/>
             <wp:effectExtent l="0" t="0" r="0" b="0"/>
             <wp:docPr id="2" name="Mermaid diagram 2" descr="Mermaid diagram"/>
             <wp:cNvGraphicFramePr>
@@ -109,7 +109,7 @@
                     <pic:cNvPicPr/>
                   </pic:nvPicPr>
                   <pic:blipFill>
-                    <a:blip xmlns:r="http://schemas.openxmlformats.org/officeDocument/2006/relationships" r:embed="Raf0269051f5d41aa"/>
+                    <a:blip xmlns:r="http://schemas.openxmlformats.org/officeDocument/2006/relationships" r:embed="Rf2c16c8fd3594444"/>
                     <a:stretch>
                       <a:fillRect/>
                     </a:stretch>
@@ -117,7 +117,7 @@
                   <pic:spPr>
                     <a:xfrm>
                       <a:off x="0" y="0"/>
-                      <a:ext cx="5220000" cy="5382641"/>
+                      <a:ext cx="5220000" cy="1603402"/>
                     </a:xfrm>
                     <a:prstGeom prst="rect">
                       <a:avLst/>
@@ -134,7 +134,7 @@
       <w:pPr>
         <w:pStyle w:val="Heading2"/>
       </w:pPr>
-      <w:bookmarkStart w:name="Md_0dba2e1d3a62485c8aff423597b08c1b" w:id="3"/>
+      <w:bookmarkStart w:name="Md_8c99372e3f774bd5b22288337104a8d3" w:id="3"/>
       <w:r>
         <w:rPr/>
         <w:t xml:space="preserve">Motivation</w:t>
@@ -149,7 +149,7 @@
       <w:r>
         <w:drawing>
           <wp:inline xmlns:wp="http://schemas.openxmlformats.org/drawingml/2006/wordprocessingDrawing" distT="0" distB="0" distL="0" distR="0">
-            <wp:extent cx="3886200" cy="5572125"/>
+            <wp:extent cx="5220000" cy="1397101"/>
             <wp:effectExtent l="0" t="0" r="0" b="0"/>
             <wp:docPr id="3" name="Mermaid diagram 3" descr="Mermaid diagram"/>
             <wp:cNvGraphicFramePr>
@@ -163,7 +163,7 @@
                     <pic:cNvPicPr/>
                   </pic:nvPicPr>
                   <pic:blipFill>
-                    <a:blip xmlns:r="http://schemas.openxmlformats.org/officeDocument/2006/relationships" r:embed="Rd469079bb3d14133"/>
+                    <a:blip xmlns:r="http://schemas.openxmlformats.org/officeDocument/2006/relationships" r:embed="R36cdd654458e4d61"/>
                     <a:stretch>
                       <a:fillRect/>
                     </a:stretch>
@@ -171,7 +171,7 @@
                   <pic:spPr>
                     <a:xfrm>
                       <a:off x="0" y="0"/>
-                      <a:ext cx="3886200" cy="5572125"/>
+                      <a:ext cx="5220000" cy="1397101"/>
                     </a:xfrm>
                     <a:prstGeom prst="rect">
                       <a:avLst/>
@@ -188,7 +188,7 @@
       <w:pPr>
         <w:pStyle w:val="Heading2"/>
       </w:pPr>
-      <w:bookmarkStart w:name="Md_b6baff7b712b44639b6661d8706d5c7e" w:id="4"/>
+      <w:bookmarkStart w:name="Md_1e44bc1e120844a78656136751c47609" w:id="4"/>
       <w:r>
         <w:rPr/>
         <w:t xml:space="preserve">Motivation to Technology</w:t>
@@ -203,7 +203,7 @@
       <w:r>
         <w:drawing>
           <wp:inline xmlns:wp="http://schemas.openxmlformats.org/drawingml/2006/wordprocessingDrawing" distT="0" distB="0" distL="0" distR="0">
-            <wp:extent cx="5220000" cy="5246907"/>
+            <wp:extent cx="5020396" cy="6480000"/>
             <wp:effectExtent l="0" t="0" r="0" b="0"/>
             <wp:docPr id="4" name="Mermaid diagram 4" descr="Mermaid diagram"/>
             <wp:cNvGraphicFramePr>
@@ -217,7 +217,7 @@
                     <pic:cNvPicPr/>
                   </pic:nvPicPr>
                   <pic:blipFill>
-                    <a:blip xmlns:r="http://schemas.openxmlformats.org/officeDocument/2006/relationships" r:embed="R4631b44d3b9b4594"/>
+                    <a:blip xmlns:r="http://schemas.openxmlformats.org/officeDocument/2006/relationships" r:embed="Rf555f55a3d7c43a2"/>
                     <a:stretch>
                       <a:fillRect/>
                     </a:stretch>
@@ -225,7 +225,7 @@
                   <pic:spPr>
                     <a:xfrm>
                       <a:off x="0" y="0"/>
-                      <a:ext cx="5220000" cy="5246907"/>
+                      <a:ext cx="5020396" cy="6480000"/>
                     </a:xfrm>
                     <a:prstGeom prst="rect">
                       <a:avLst/>

</xml_diff>

<commit_message>
Add a flowchart parity harness and fix enterprise mapping.
Map compounds and groups to nested subgraphs, inject enterprise leaf sizes into flowchart layout, and draw nodes at the same SVG rectangles the layout produced. Rank every relationship as a forward edge so ArchiMate dashes stay on the draw path. Compare node rectangles and edge paths of each sample against an equivalent mermaid flowchart TB.

Co-authored-by: Dave Robinson <windows_mcp@hotmail.com>
</commit_message>
<xml_diff>
--- a/docs/enterprise/rendered/enterprise-samples.docx
+++ b/docs/enterprise/rendered/enterprise-samples.docx
@@ -6,7 +6,7 @@
       <w:pPr>
         <w:pStyle w:val="Heading1"/>
       </w:pPr>
-      <w:bookmarkStart w:name="Md_a1376cc78d9741dc883bdf890312ae36" w:id="0"/>
+      <w:bookmarkStart w:name="Md_3ee5ced723794b9a9284b760e444b248" w:id="0"/>
       <w:r>
         <w:rPr/>
         <w:t xml:space="preserve">Enterprise diagram samples</w:t>
@@ -26,7 +26,7 @@
       <w:pPr>
         <w:pStyle w:val="Heading2"/>
       </w:pPr>
-      <w:bookmarkStart w:name="Md_6e6e6eef570f40fa9fd14f70d9127855" w:id="1"/>
+      <w:bookmarkStart w:name="Md_33ba2ce201994edbada964c28f6adf0f" w:id="1"/>
       <w:r>
         <w:rPr/>
         <w:t xml:space="preserve">Cross-layer web shop</w:t>
@@ -41,7 +41,7 @@
       <w:r>
         <w:drawing>
           <wp:inline xmlns:wp="http://schemas.openxmlformats.org/drawingml/2006/wordprocessingDrawing" distT="0" distB="0" distL="0" distR="0">
-            <wp:extent cx="5220000" cy="3238489"/>
+            <wp:extent cx="5220000" cy="2693217"/>
             <wp:effectExtent l="0" t="0" r="0" b="0"/>
             <wp:docPr id="1" name="Mermaid diagram 1" descr="Mermaid diagram"/>
             <wp:cNvGraphicFramePr>
@@ -55,7 +55,7 @@
                     <pic:cNvPicPr/>
                   </pic:nvPicPr>
                   <pic:blipFill>
-                    <a:blip xmlns:r="http://schemas.openxmlformats.org/officeDocument/2006/relationships" r:embed="R6505b8c3d7d4436f"/>
+                    <a:blip xmlns:r="http://schemas.openxmlformats.org/officeDocument/2006/relationships" r:embed="R37328725d98a4922"/>
                     <a:stretch>
                       <a:fillRect/>
                     </a:stretch>
@@ -63,7 +63,7 @@
                   <pic:spPr>
                     <a:xfrm>
                       <a:off x="0" y="0"/>
-                      <a:ext cx="5220000" cy="3238489"/>
+                      <a:ext cx="5220000" cy="2693217"/>
                     </a:xfrm>
                     <a:prstGeom prst="rect">
                       <a:avLst/>
@@ -80,7 +80,7 @@
       <w:pPr>
         <w:pStyle w:val="Heading2"/>
       </w:pPr>
-      <w:bookmarkStart w:name="Md_3dc9f84c1a424d01ad034ecfb5b3f2c0" w:id="2"/>
+      <w:bookmarkStart w:name="Md_9d346fa68006408d814ea46a02ac61de" w:id="2"/>
       <w:r>
         <w:rPr/>
         <w:t xml:space="preserve">Business layer</w:t>
@@ -95,7 +95,7 @@
       <w:r>
         <w:drawing>
           <wp:inline xmlns:wp="http://schemas.openxmlformats.org/drawingml/2006/wordprocessingDrawing" distT="0" distB="0" distL="0" distR="0">
-            <wp:extent cx="5220000" cy="1603402"/>
+            <wp:extent cx="5220000" cy="1588530"/>
             <wp:effectExtent l="0" t="0" r="0" b="0"/>
             <wp:docPr id="2" name="Mermaid diagram 2" descr="Mermaid diagram"/>
             <wp:cNvGraphicFramePr>
@@ -109,7 +109,7 @@
                     <pic:cNvPicPr/>
                   </pic:nvPicPr>
                   <pic:blipFill>
-                    <a:blip xmlns:r="http://schemas.openxmlformats.org/officeDocument/2006/relationships" r:embed="Rf2c16c8fd3594444"/>
+                    <a:blip xmlns:r="http://schemas.openxmlformats.org/officeDocument/2006/relationships" r:embed="R2f8f40b347944093"/>
                     <a:stretch>
                       <a:fillRect/>
                     </a:stretch>
@@ -117,7 +117,7 @@
                   <pic:spPr>
                     <a:xfrm>
                       <a:off x="0" y="0"/>
-                      <a:ext cx="5220000" cy="1603402"/>
+                      <a:ext cx="5220000" cy="1588530"/>
                     </a:xfrm>
                     <a:prstGeom prst="rect">
                       <a:avLst/>
@@ -134,7 +134,7 @@
       <w:pPr>
         <w:pStyle w:val="Heading2"/>
       </w:pPr>
-      <w:bookmarkStart w:name="Md_8c99372e3f774bd5b22288337104a8d3" w:id="3"/>
+      <w:bookmarkStart w:name="Md_08036f7abe0c4bda8d9f09ac1387c387" w:id="3"/>
       <w:r>
         <w:rPr/>
         <w:t xml:space="preserve">Motivation</w:t>
@@ -149,7 +149,7 @@
       <w:r>
         <w:drawing>
           <wp:inline xmlns:wp="http://schemas.openxmlformats.org/drawingml/2006/wordprocessingDrawing" distT="0" distB="0" distL="0" distR="0">
-            <wp:extent cx="5220000" cy="1397101"/>
+            <wp:extent cx="5220000" cy="1113457"/>
             <wp:effectExtent l="0" t="0" r="0" b="0"/>
             <wp:docPr id="3" name="Mermaid diagram 3" descr="Mermaid diagram"/>
             <wp:cNvGraphicFramePr>
@@ -163,7 +163,7 @@
                     <pic:cNvPicPr/>
                   </pic:nvPicPr>
                   <pic:blipFill>
-                    <a:blip xmlns:r="http://schemas.openxmlformats.org/officeDocument/2006/relationships" r:embed="R36cdd654458e4d61"/>
+                    <a:blip xmlns:r="http://schemas.openxmlformats.org/officeDocument/2006/relationships" r:embed="R4566ae3378bf4022"/>
                     <a:stretch>
                       <a:fillRect/>
                     </a:stretch>
@@ -171,7 +171,7 @@
                   <pic:spPr>
                     <a:xfrm>
                       <a:off x="0" y="0"/>
-                      <a:ext cx="5220000" cy="1397101"/>
+                      <a:ext cx="5220000" cy="1113457"/>
                     </a:xfrm>
                     <a:prstGeom prst="rect">
                       <a:avLst/>
@@ -188,7 +188,7 @@
       <w:pPr>
         <w:pStyle w:val="Heading2"/>
       </w:pPr>
-      <w:bookmarkStart w:name="Md_1e44bc1e120844a78656136751c47609" w:id="4"/>
+      <w:bookmarkStart w:name="Md_d4a9a322198a4a078b5ba43f79c73efd" w:id="4"/>
       <w:r>
         <w:rPr/>
         <w:t xml:space="preserve">Motivation to Technology</w:t>
@@ -203,7 +203,7 @@
       <w:r>
         <w:drawing>
           <wp:inline xmlns:wp="http://schemas.openxmlformats.org/drawingml/2006/wordprocessingDrawing" distT="0" distB="0" distL="0" distR="0">
-            <wp:extent cx="5020396" cy="6480000"/>
+            <wp:extent cx="4556389" cy="6480000"/>
             <wp:effectExtent l="0" t="0" r="0" b="0"/>
             <wp:docPr id="4" name="Mermaid diagram 4" descr="Mermaid diagram"/>
             <wp:cNvGraphicFramePr>
@@ -217,7 +217,7 @@
                     <pic:cNvPicPr/>
                   </pic:nvPicPr>
                   <pic:blipFill>
-                    <a:blip xmlns:r="http://schemas.openxmlformats.org/officeDocument/2006/relationships" r:embed="Rf555f55a3d7c43a2"/>
+                    <a:blip xmlns:r="http://schemas.openxmlformats.org/officeDocument/2006/relationships" r:embed="R19929f7f063041b9"/>
                     <a:stretch>
                       <a:fillRect/>
                     </a:stretch>
@@ -225,7 +225,7 @@
                   <pic:spPr>
                     <a:xfrm>
                       <a:off x="0" y="0"/>
-                      <a:ext cx="5020396" cy="6480000"/>
+                      <a:ext cx="4556389" cy="6480000"/>
                     </a:xfrm>
                     <a:prstGeom prst="rect">
                       <a:avLst/>

</xml_diff>